<commit_message>
docs: formalize edhr design deliverables
</commit_message>
<xml_diff>
--- a/doc/tasks/20260728-edhr-batch-record-design-docs/output/EDHR_Batch_Record_Detailed_Design.docx
+++ b/doc/tasks/20260728-edhr-batch-record-design-docs/output/EDHR_Batch_Record_Detailed_Design.docx
@@ -14,7 +14,7 @@
           <w:color w:val="0B2545"/>
           <w:sz w:val="52"/>
         </w:rPr>
-        <w:t>EDHR 批记录系统详细设计</w:t>
+        <w:t>EDHR 批记录系统详细设计说明书</w:t>
       </w:r>
     </w:p>
     <w:p>
@@ -25,10 +25,11 @@
       <w:r>
         <w:rPr>
           <w:rFonts w:ascii="Calibri" w:hAnsi="Calibri" w:eastAsia="Microsoft YaHei"/>
+          <w:b w:val="0"/>
           <w:color w:val="2E74B5"/>
           <w:sz w:val="30"/>
         </w:rPr>
-        <w:t>由概要设计落到当前接口、服务、表结构与页面实现</w:t>
+        <w:t>电子批记录系统建设详细设计说明</w:t>
       </w:r>
     </w:p>
     <w:tbl>
@@ -50,12 +51,14 @@
             <w:pPr>
               <w:spacing w:after="0"/>
             </w:pPr>
+            <w:r/>
             <w:r>
               <w:rPr>
                 <w:rFonts w:ascii="Calibri" w:hAnsi="Calibri" w:eastAsia="Microsoft YaHei"/>
+                <w:b/>
                 <w:sz w:val="20"/>
               </w:rPr>
-              <w:t>文档类型</w:t>
+              <w:t>项目</w:t>
             </w:r>
           </w:p>
         </w:tc>
@@ -67,12 +70,14 @@
             <w:pPr>
               <w:spacing w:after="0"/>
             </w:pPr>
+            <w:r/>
             <w:r>
               <w:rPr>
                 <w:rFonts w:ascii="Calibri" w:hAnsi="Calibri" w:eastAsia="Microsoft YaHei"/>
+                <w:b/>
                 <w:sz w:val="20"/>
               </w:rPr>
-              <w:t>详细设计</w:t>
+              <w:t>内容</w:t>
             </w:r>
           </w:p>
         </w:tc>
@@ -86,12 +91,14 @@
             <w:pPr>
               <w:spacing w:after="0"/>
             </w:pPr>
+            <w:r/>
             <w:r>
               <w:rPr>
                 <w:rFonts w:ascii="Calibri" w:hAnsi="Calibri" w:eastAsia="Microsoft YaHei"/>
+                <w:b w:val="0"/>
                 <w:sz w:val="20"/>
               </w:rPr>
-              <w:t>生成方式</w:t>
+              <w:t>项目名称</w:t>
             </w:r>
           </w:p>
         </w:tc>
@@ -103,12 +110,14 @@
             <w:pPr>
               <w:spacing w:after="0"/>
             </w:pPr>
+            <w:r/>
             <w:r>
               <w:rPr>
                 <w:rFonts w:ascii="Calibri" w:hAnsi="Calibri" w:eastAsia="Microsoft YaHei"/>
+                <w:b w:val="0"/>
                 <w:sz w:val="20"/>
               </w:rPr>
-              <w:t>从合并版 EDHR 批记录系统设计文档按章节拆分</w:t>
+              <w:t>EDHR 批记录系统建设项目</w:t>
             </w:r>
           </w:p>
         </w:tc>
@@ -122,12 +131,14 @@
             <w:pPr>
               <w:spacing w:after="0"/>
             </w:pPr>
+            <w:r/>
             <w:r>
               <w:rPr>
                 <w:rFonts w:ascii="Calibri" w:hAnsi="Calibri" w:eastAsia="Microsoft YaHei"/>
+                <w:b w:val="0"/>
                 <w:sz w:val="20"/>
               </w:rPr>
-              <w:t>逻辑关系</w:t>
+              <w:t>文档名称</w:t>
             </w:r>
           </w:p>
         </w:tc>
@@ -139,12 +150,14 @@
             <w:pPr>
               <w:spacing w:after="0"/>
             </w:pPr>
+            <w:r/>
             <w:r>
               <w:rPr>
                 <w:rFonts w:ascii="Calibri" w:hAnsi="Calibri" w:eastAsia="Microsoft YaHei"/>
+                <w:b w:val="0"/>
                 <w:sz w:val="20"/>
               </w:rPr>
-              <w:t>需求设计 -&gt; 概要设计 -&gt; 详细设计；当前文件为其中一个独立设计文档</w:t>
+              <w:t>详细设计说明书</w:t>
             </w:r>
           </w:p>
         </w:tc>
@@ -158,12 +171,14 @@
             <w:pPr>
               <w:spacing w:after="0"/>
             </w:pPr>
+            <w:r/>
             <w:r>
               <w:rPr>
                 <w:rFonts w:ascii="Calibri" w:hAnsi="Calibri" w:eastAsia="Microsoft YaHei"/>
+                <w:b w:val="0"/>
                 <w:sz w:val="20"/>
               </w:rPr>
-              <w:t>源文件</w:t>
+              <w:t>文档版本</w:t>
             </w:r>
           </w:p>
         </w:tc>
@@ -175,12 +190,14 @@
             <w:pPr>
               <w:spacing w:after="0"/>
             </w:pPr>
+            <w:r/>
             <w:r>
               <w:rPr>
                 <w:rFonts w:ascii="Calibri" w:hAnsi="Calibri" w:eastAsia="Microsoft YaHei"/>
+                <w:b w:val="0"/>
                 <w:sz w:val="20"/>
               </w:rPr>
-              <w:t>EDHR_Batch_Record_System_Design.docx</w:t>
+              <w:t>V1.0</w:t>
             </w:r>
           </w:p>
         </w:tc>
@@ -194,12 +211,14 @@
             <w:pPr>
               <w:spacing w:after="0"/>
             </w:pPr>
+            <w:r/>
             <w:r>
               <w:rPr>
                 <w:rFonts w:ascii="Calibri" w:hAnsi="Calibri" w:eastAsia="Microsoft YaHei"/>
+                <w:b w:val="0"/>
                 <w:sz w:val="20"/>
               </w:rPr>
-              <w:t>生成日期</w:t>
+              <w:t>编制日期</w:t>
             </w:r>
           </w:p>
         </w:tc>
@@ -211,12 +230,94 @@
             <w:pPr>
               <w:spacing w:after="0"/>
             </w:pPr>
+            <w:r/>
             <w:r>
               <w:rPr>
                 <w:rFonts w:ascii="Calibri" w:hAnsi="Calibri" w:eastAsia="Microsoft YaHei"/>
+                <w:b w:val="0"/>
                 <w:sz w:val="20"/>
               </w:rPr>
-              <w:t>2026-07-28</w:t>
+              <w:t>2026年7月28日</w:t>
+            </w:r>
+          </w:p>
+        </w:tc>
+      </w:tr>
+      <w:tr>
+        <w:tc>
+          <w:tcPr>
+            <w:tcW w:type="dxa" w:w="4680"/>
+          </w:tcPr>
+          <w:p>
+            <w:pPr>
+              <w:spacing w:after="0"/>
+            </w:pPr>
+            <w:r/>
+            <w:r>
+              <w:rPr>
+                <w:rFonts w:ascii="Calibri" w:hAnsi="Calibri" w:eastAsia="Microsoft YaHei"/>
+                <w:b w:val="0"/>
+                <w:sz w:val="20"/>
+              </w:rPr>
+              <w:t>文档状态</w:t>
+            </w:r>
+          </w:p>
+        </w:tc>
+        <w:tc>
+          <w:tcPr>
+            <w:tcW w:type="dxa" w:w="4680"/>
+          </w:tcPr>
+          <w:p>
+            <w:pPr>
+              <w:spacing w:after="0"/>
+            </w:pPr>
+            <w:r/>
+            <w:r>
+              <w:rPr>
+                <w:rFonts w:ascii="Calibri" w:hAnsi="Calibri" w:eastAsia="Microsoft YaHei"/>
+                <w:b w:val="0"/>
+                <w:sz w:val="20"/>
+              </w:rPr>
+              <w:t>正式交付版</w:t>
+            </w:r>
+          </w:p>
+        </w:tc>
+      </w:tr>
+      <w:tr>
+        <w:tc>
+          <w:tcPr>
+            <w:tcW w:type="dxa" w:w="4680"/>
+          </w:tcPr>
+          <w:p>
+            <w:pPr>
+              <w:spacing w:after="0"/>
+            </w:pPr>
+            <w:r/>
+            <w:r>
+              <w:rPr>
+                <w:rFonts w:ascii="Calibri" w:hAnsi="Calibri" w:eastAsia="Microsoft YaHei"/>
+                <w:b w:val="0"/>
+                <w:sz w:val="20"/>
+              </w:rPr>
+              <w:t>适用范围</w:t>
+            </w:r>
+          </w:p>
+        </w:tc>
+        <w:tc>
+          <w:tcPr>
+            <w:tcW w:type="dxa" w:w="4680"/>
+          </w:tcPr>
+          <w:p>
+            <w:pPr>
+              <w:spacing w:after="0"/>
+            </w:pPr>
+            <w:r/>
+            <w:r>
+              <w:rPr>
+                <w:rFonts w:ascii="Calibri" w:hAnsi="Calibri" w:eastAsia="Microsoft YaHei"/>
+                <w:b w:val="0"/>
+                <w:sz w:val="20"/>
+              </w:rPr>
+              <w:t>后端接口、服务组件、前端页面、数据模型、关键事务、错误模型和验证策略</w:t>
             </w:r>
           </w:p>
         </w:tc>
@@ -249,8 +350,10 @@
       <w:r>
         <w:rPr>
           <w:rFonts w:ascii="Calibri" w:hAnsi="Calibri" w:eastAsia="Microsoft YaHei"/>
+          <w:b w:val="0"/>
+          <w:sz w:val="22"/>
         </w:rPr>
-        <w:t>本文档不是从零假设的未来方案，而是根据当前 IntRuoyi 项目中已经存在的 EDHR 批记录系统进行反向整理。因此文档中的需求设计、概要设计和详细设计均以现有代码、接口、数据表、规则门禁和历史验证证据为边界。</w:t>
+        <w:t>本文档为 EDHR 批记录系统建设项目正式设计文件，用于明确系统建设目标、业务范围、设计边界、实现要求和验收依据。文档内容服务于项目实施、测试验证、上线交付和后续维护。</w:t>
       </w:r>
     </w:p>
     <w:p>
@@ -260,8 +363,10 @@
       <w:r>
         <w:rPr>
           <w:rFonts w:ascii="Calibri" w:hAnsi="Calibri" w:eastAsia="Microsoft YaHei"/>
+          <w:b w:val="0"/>
+          <w:sz w:val="22"/>
         </w:rPr>
-        <w:t>为了保持设计文档的工程逻辑，本文仍按正常推导顺序呈现：需求设计定义用户价值、业务范围和验收口径；概要设计把需求拆成模块、流程和数据边界；详细设计再落到当前控制器、服务、前端页面、接口和数据表。</w:t>
+        <w:t>本项目文档体系按照需求设计、概要设计、详细设计逐层展开。需求设计明确业务与验收要求，概要设计定义系统总体方案，详细设计细化到接口、服务、数据和页面实现。</w:t>
       </w:r>
     </w:p>
     <w:tbl>
@@ -292,14 +397,16 @@
           </w:tcPr>
           <w:p>
             <w:pPr>
-              <w:spacing w:before="0" w:after="0" w:line="252" w:lineRule="auto"/>
+              <w:spacing w:after="0"/>
             </w:pPr>
+            <w:r/>
             <w:r>
               <w:rPr>
                 <w:rFonts w:ascii="Calibri" w:hAnsi="Calibri" w:eastAsia="Microsoft YaHei"/>
                 <w:b/>
+                <w:sz w:val="20"/>
               </w:rPr>
-              <w:t>设计层级</w:t>
+              <w:t>文档体系</w:t>
             </w:r>
           </w:p>
         </w:tc>
@@ -317,14 +424,16 @@
           </w:tcPr>
           <w:p>
             <w:pPr>
-              <w:spacing w:before="0" w:after="0" w:line="252" w:lineRule="auto"/>
+              <w:spacing w:after="0"/>
             </w:pPr>
+            <w:r/>
             <w:r>
               <w:rPr>
                 <w:rFonts w:ascii="Calibri" w:hAnsi="Calibri" w:eastAsia="Microsoft YaHei"/>
                 <w:b/>
+                <w:sz w:val="20"/>
               </w:rPr>
-              <w:t>倒推方式</w:t>
+              <w:t>主要内容</w:t>
             </w:r>
           </w:p>
         </w:tc>
@@ -342,14 +451,16 @@
           </w:tcPr>
           <w:p>
             <w:pPr>
-              <w:spacing w:before="0" w:after="0" w:line="252" w:lineRule="auto"/>
+              <w:spacing w:after="0"/>
             </w:pPr>
+            <w:r/>
             <w:r>
               <w:rPr>
                 <w:rFonts w:ascii="Calibri" w:hAnsi="Calibri" w:eastAsia="Microsoft YaHei"/>
                 <w:b/>
+                <w:sz w:val="20"/>
               </w:rPr>
-              <w:t>交付重点</w:t>
+              <w:t>交付作用</w:t>
             </w:r>
           </w:p>
         </w:tc>
@@ -368,11 +479,13 @@
           </w:tcPr>
           <w:p>
             <w:pPr>
-              <w:spacing w:before="0" w:after="0" w:line="252" w:lineRule="auto"/>
+              <w:spacing w:after="0"/>
             </w:pPr>
+            <w:r/>
             <w:r>
               <w:rPr>
                 <w:rFonts w:ascii="Calibri" w:hAnsi="Calibri" w:eastAsia="Microsoft YaHei"/>
+                <w:b w:val="0"/>
                 <w:sz w:val="20"/>
               </w:rPr>
               <w:t>需求设计</w:t>
@@ -392,14 +505,16 @@
           </w:tcPr>
           <w:p>
             <w:pPr>
-              <w:spacing w:before="0" w:after="0" w:line="252" w:lineRule="auto"/>
+              <w:spacing w:after="0"/>
             </w:pPr>
+            <w:r/>
             <w:r>
               <w:rPr>
                 <w:rFonts w:ascii="Calibri" w:hAnsi="Calibri" w:eastAsia="Microsoft YaHei"/>
+                <w:b w:val="0"/>
                 <w:sz w:val="20"/>
               </w:rPr>
-              <w:t>从现有功能、规则和真实验收门禁抽象用户目标与业务规则</w:t>
+              <w:t>明确系统建设目标、业务范围、用户角色、功能需求、业务规则、状态流转与验收标准。</w:t>
             </w:r>
           </w:p>
         </w:tc>
@@ -416,14 +531,16 @@
           </w:tcPr>
           <w:p>
             <w:pPr>
-              <w:spacing w:before="0" w:after="0" w:line="252" w:lineRule="auto"/>
+              <w:spacing w:after="0"/>
             </w:pPr>
+            <w:r/>
             <w:r>
               <w:rPr>
                 <w:rFonts w:ascii="Calibri" w:hAnsi="Calibri" w:eastAsia="Microsoft YaHei"/>
+                <w:b w:val="0"/>
                 <w:sz w:val="20"/>
               </w:rPr>
-              <w:t>范围、角色、流程、功能需求、业务规则、验收标准</w:t>
+              <w:t>作为概要设计、测试验收和项目范围确认的输入。</w:t>
             </w:r>
           </w:p>
         </w:tc>
@@ -442,11 +559,13 @@
           </w:tcPr>
           <w:p>
             <w:pPr>
-              <w:spacing w:before="0" w:after="0" w:line="252" w:lineRule="auto"/>
+              <w:spacing w:after="0"/>
             </w:pPr>
+            <w:r/>
             <w:r>
               <w:rPr>
                 <w:rFonts w:ascii="Calibri" w:hAnsi="Calibri" w:eastAsia="Microsoft YaHei"/>
+                <w:b w:val="0"/>
                 <w:sz w:val="20"/>
               </w:rPr>
               <w:t>概要设计</w:t>
@@ -466,14 +585,16 @@
           </w:tcPr>
           <w:p>
             <w:pPr>
-              <w:spacing w:before="0" w:after="0" w:line="252" w:lineRule="auto"/>
+              <w:spacing w:after="0"/>
             </w:pPr>
+            <w:r/>
             <w:r>
               <w:rPr>
                 <w:rFonts w:ascii="Calibri" w:hAnsi="Calibri" w:eastAsia="Microsoft YaHei"/>
+                <w:b w:val="0"/>
                 <w:sz w:val="20"/>
               </w:rPr>
-              <w:t>把需求映射为系统模块、接口分组、数据域和关键流程</w:t>
+              <w:t>依据需求设计定义系统总体架构、模块划分、核心流程、接口分组、数据域和非功能要求。</w:t>
             </w:r>
           </w:p>
         </w:tc>
@@ -490,14 +611,16 @@
           </w:tcPr>
           <w:p>
             <w:pPr>
-              <w:spacing w:before="0" w:after="0" w:line="252" w:lineRule="auto"/>
+              <w:spacing w:after="0"/>
             </w:pPr>
+            <w:r/>
             <w:r>
               <w:rPr>
                 <w:rFonts w:ascii="Calibri" w:hAnsi="Calibri" w:eastAsia="Microsoft YaHei"/>
+                <w:b w:val="0"/>
                 <w:sz w:val="20"/>
               </w:rPr>
-              <w:t>系统架构、模块边界、核心流程、数据分组、异常和权限</w:t>
+              <w:t>作为详细设计、接口设计和开发实施的总体依据。</w:t>
             </w:r>
           </w:p>
         </w:tc>
@@ -516,11 +639,13 @@
           </w:tcPr>
           <w:p>
             <w:pPr>
-              <w:spacing w:before="0" w:after="0" w:line="252" w:lineRule="auto"/>
+              <w:spacing w:after="0"/>
             </w:pPr>
+            <w:r/>
             <w:r>
               <w:rPr>
                 <w:rFonts w:ascii="Calibri" w:hAnsi="Calibri" w:eastAsia="Microsoft YaHei"/>
+                <w:b w:val="0"/>
                 <w:sz w:val="20"/>
               </w:rPr>
               <w:t>详细设计</w:t>
@@ -540,14 +665,16 @@
           </w:tcPr>
           <w:p>
             <w:pPr>
-              <w:spacing w:before="0" w:after="0" w:line="252" w:lineRule="auto"/>
+              <w:spacing w:after="0"/>
             </w:pPr>
+            <w:r/>
             <w:r>
               <w:rPr>
                 <w:rFonts w:ascii="Calibri" w:hAnsi="Calibri" w:eastAsia="Microsoft YaHei"/>
+                <w:b w:val="0"/>
                 <w:sz w:val="20"/>
               </w:rPr>
-              <w:t>把概要模块落到当前源代码、API、表结构、页面和关键算法</w:t>
+              <w:t>依据概要设计细化控制器、服务组件、前端页面、数据表、关键算法、事务和错误模型。</w:t>
             </w:r>
           </w:p>
         </w:tc>
@@ -564,14 +691,16 @@
           </w:tcPr>
           <w:p>
             <w:pPr>
-              <w:spacing w:before="0" w:after="0" w:line="252" w:lineRule="auto"/>
+              <w:spacing w:after="0"/>
             </w:pPr>
+            <w:r/>
             <w:r>
               <w:rPr>
                 <w:rFonts w:ascii="Calibri" w:hAnsi="Calibri" w:eastAsia="Microsoft YaHei"/>
+                <w:b w:val="0"/>
                 <w:sz w:val="20"/>
               </w:rPr>
-              <w:t>控制器、服务、表、前端适配、状态机、哈希审计、验证策略</w:t>
+              <w:t>作为开发实现、联调测试、上线验证和运维交接的实施依据。</w:t>
             </w:r>
           </w:p>
         </w:tc>
@@ -590,7 +719,7 @@
           <w:color w:val="2E74B5"/>
           <w:sz w:val="26"/>
         </w:rPr>
-        <w:t>0.1 证据来源</w:t>
+        <w:t>0.1 编制依据</w:t>
       </w:r>
     </w:p>
     <w:tbl>
@@ -621,14 +750,16 @@
           </w:tcPr>
           <w:p>
             <w:pPr>
-              <w:spacing w:before="0" w:after="0" w:line="252" w:lineRule="auto"/>
+              <w:spacing w:after="0"/>
             </w:pPr>
+            <w:r/>
             <w:r>
               <w:rPr>
                 <w:rFonts w:ascii="Calibri" w:hAnsi="Calibri" w:eastAsia="Microsoft YaHei"/>
                 <w:b/>
+                <w:sz w:val="20"/>
               </w:rPr>
-              <w:t>证据类型</w:t>
+              <w:t>依据类别</w:t>
             </w:r>
           </w:p>
         </w:tc>
@@ -646,14 +777,16 @@
           </w:tcPr>
           <w:p>
             <w:pPr>
-              <w:spacing w:before="0" w:after="0" w:line="252" w:lineRule="auto"/>
+              <w:spacing w:after="0"/>
             </w:pPr>
+            <w:r/>
             <w:r>
               <w:rPr>
                 <w:rFonts w:ascii="Calibri" w:hAnsi="Calibri" w:eastAsia="Microsoft YaHei"/>
                 <w:b/>
+                <w:sz w:val="20"/>
               </w:rPr>
-              <w:t>证据路径或来源</w:t>
+              <w:t>依据内容</w:t>
             </w:r>
           </w:p>
         </w:tc>
@@ -671,14 +804,16 @@
           </w:tcPr>
           <w:p>
             <w:pPr>
-              <w:spacing w:before="0" w:after="0" w:line="252" w:lineRule="auto"/>
+              <w:spacing w:after="0"/>
             </w:pPr>
+            <w:r/>
             <w:r>
               <w:rPr>
                 <w:rFonts w:ascii="Calibri" w:hAnsi="Calibri" w:eastAsia="Microsoft YaHei"/>
                 <w:b/>
+                <w:sz w:val="20"/>
               </w:rPr>
-              <w:t>用于支撑</w:t>
+              <w:t>适用说明</w:t>
             </w:r>
           </w:p>
         </w:tc>
@@ -697,14 +832,16 @@
           </w:tcPr>
           <w:p>
             <w:pPr>
-              <w:spacing w:before="0" w:after="0" w:line="252" w:lineRule="auto"/>
+              <w:spacing w:after="0"/>
             </w:pPr>
+            <w:r/>
             <w:r>
               <w:rPr>
                 <w:rFonts w:ascii="Calibri" w:hAnsi="Calibri" w:eastAsia="Microsoft YaHei"/>
+                <w:b w:val="0"/>
                 <w:sz w:val="20"/>
               </w:rPr>
-              <w:t>项目规则</w:t>
+              <w:t>业务管理要求</w:t>
             </w:r>
           </w:p>
         </w:tc>
@@ -721,14 +858,16 @@
           </w:tcPr>
           <w:p>
             <w:pPr>
-              <w:spacing w:before="0" w:after="0" w:line="252" w:lineRule="auto"/>
+              <w:spacing w:after="0"/>
             </w:pPr>
+            <w:r/>
             <w:r>
               <w:rPr>
                 <w:rFonts w:ascii="Calibri" w:hAnsi="Calibri" w:eastAsia="Microsoft YaHei"/>
+                <w:b w:val="0"/>
                 <w:sz w:val="20"/>
               </w:rPr>
-              <w:t>AGENTS.md、docs/backend-development.md、docs/frontend-development.md、docs/e2e-rules.md</w:t>
+              <w:t>电子批生产记录管理、生产过程记录完整性、质量审核追溯和批次放行管理要求。</w:t>
             </w:r>
           </w:p>
         </w:tc>
@@ -745,14 +884,16 @@
           </w:tcPr>
           <w:p>
             <w:pPr>
-              <w:spacing w:before="0" w:after="0" w:line="252" w:lineRule="auto"/>
+              <w:spacing w:after="0"/>
             </w:pPr>
+            <w:r/>
             <w:r>
               <w:rPr>
                 <w:rFonts w:ascii="Calibri" w:hAnsi="Calibri" w:eastAsia="Microsoft YaHei"/>
+                <w:b w:val="0"/>
                 <w:sz w:val="20"/>
               </w:rPr>
-              <w:t>术语契约、无 fallback、EDHR 运行态门禁、E2E 真实路径要求</w:t>
+              <w:t>确定系统建设目标、业务范围、角色职责和验收口径。</w:t>
             </w:r>
           </w:p>
         </w:tc>
@@ -771,14 +912,16 @@
           </w:tcPr>
           <w:p>
             <w:pPr>
-              <w:spacing w:before="0" w:after="0" w:line="252" w:lineRule="auto"/>
+              <w:spacing w:after="0"/>
             </w:pPr>
+            <w:r/>
             <w:r>
               <w:rPr>
                 <w:rFonts w:ascii="Calibri" w:hAnsi="Calibri" w:eastAsia="Microsoft YaHei"/>
+                <w:b w:val="0"/>
                 <w:sz w:val="20"/>
               </w:rPr>
-              <w:t>后端合约</w:t>
+              <w:t>系统建设范围</w:t>
             </w:r>
           </w:p>
         </w:tc>
@@ -795,14 +938,16 @@
           </w:tcPr>
           <w:p>
             <w:pPr>
-              <w:spacing w:before="0" w:after="0" w:line="252" w:lineRule="auto"/>
+              <w:spacing w:after="0"/>
             </w:pPr>
+            <w:r/>
             <w:r>
               <w:rPr>
                 <w:rFonts w:ascii="Calibri" w:hAnsi="Calibri" w:eastAsia="Microsoft YaHei"/>
+                <w:b w:val="0"/>
                 <w:sz w:val="20"/>
               </w:rPr>
-              <w:t>IntRuoyiBackend/docs/edhr/existing-edhr-contract.md</w:t>
+              <w:t>批记录模板、工艺路线、批次执行、工作任务、电子签名、字段审计、归档、变更和交付证据。</w:t>
             </w:r>
           </w:p>
         </w:tc>
@@ -819,14 +964,16 @@
           </w:tcPr>
           <w:p>
             <w:pPr>
-              <w:spacing w:before="0" w:after="0" w:line="252" w:lineRule="auto"/>
+              <w:spacing w:after="0"/>
             </w:pPr>
+            <w:r/>
             <w:r>
               <w:rPr>
                 <w:rFonts w:ascii="Calibri" w:hAnsi="Calibri" w:eastAsia="Microsoft YaHei"/>
+                <w:b w:val="0"/>
                 <w:sz w:val="20"/>
               </w:rPr>
-              <w:t>后端对象、接口、权限、数据对象和禁止改写边界</w:t>
+              <w:t>确定功能模块边界和主数据关系。</w:t>
             </w:r>
           </w:p>
         </w:tc>
@@ -845,14 +992,16 @@
           </w:tcPr>
           <w:p>
             <w:pPr>
-              <w:spacing w:before="0" w:after="0" w:line="252" w:lineRule="auto"/>
+              <w:spacing w:after="0"/>
             </w:pPr>
+            <w:r/>
             <w:r>
               <w:rPr>
                 <w:rFonts w:ascii="Calibri" w:hAnsi="Calibri" w:eastAsia="Microsoft YaHei"/>
+                <w:b w:val="0"/>
                 <w:sz w:val="20"/>
               </w:rPr>
-              <w:t>前端合约</w:t>
+              <w:t>合规控制要求</w:t>
             </w:r>
           </w:p>
         </w:tc>
@@ -869,14 +1018,16 @@
           </w:tcPr>
           <w:p>
             <w:pPr>
-              <w:spacing w:before="0" w:after="0" w:line="252" w:lineRule="auto"/>
+              <w:spacing w:after="0"/>
             </w:pPr>
+            <w:r/>
             <w:r>
               <w:rPr>
                 <w:rFonts w:ascii="Calibri" w:hAnsi="Calibri" w:eastAsia="Microsoft YaHei"/>
+                <w:b w:val="0"/>
                 <w:sz w:val="20"/>
               </w:rPr>
-              <w:t>IntRuoyiFronted/docs/edhr/existing-edhr-frontend-contract.md</w:t>
+              <w:t>权限控制、操作审计、字段变更留痕、电子签名、归档下载、作废重开补录和异常处理。</w:t>
             </w:r>
           </w:p>
         </w:tc>
@@ -893,14 +1044,16 @@
           </w:tcPr>
           <w:p>
             <w:pPr>
-              <w:spacing w:before="0" w:after="0" w:line="252" w:lineRule="auto"/>
+              <w:spacing w:after="0"/>
             </w:pPr>
+            <w:r/>
             <w:r>
               <w:rPr>
                 <w:rFonts w:ascii="Calibri" w:hAnsi="Calibri" w:eastAsia="Microsoft YaHei"/>
+                <w:b w:val="0"/>
                 <w:sz w:val="20"/>
               </w:rPr>
-              <w:t>前端 API 适配层、页面入口和权限门禁</w:t>
+              <w:t>确定安全、审计、追溯和终态保护要求。</w:t>
             </w:r>
           </w:p>
         </w:tc>
@@ -919,14 +1072,16 @@
           </w:tcPr>
           <w:p>
             <w:pPr>
-              <w:spacing w:before="0" w:after="0" w:line="252" w:lineRule="auto"/>
+              <w:spacing w:after="0"/>
             </w:pPr>
+            <w:r/>
             <w:r>
               <w:rPr>
                 <w:rFonts w:ascii="Calibri" w:hAnsi="Calibri" w:eastAsia="Microsoft YaHei"/>
+                <w:b w:val="0"/>
                 <w:sz w:val="20"/>
               </w:rPr>
-              <w:t>源代码抽取</w:t>
+              <w:t>技术实现约束</w:t>
             </w:r>
           </w:p>
         </w:tc>
@@ -943,14 +1098,16 @@
           </w:tcPr>
           <w:p>
             <w:pPr>
-              <w:spacing w:before="0" w:after="0" w:line="252" w:lineRule="auto"/>
+              <w:spacing w:after="0"/>
             </w:pPr>
+            <w:r/>
             <w:r>
               <w:rPr>
                 <w:rFonts w:ascii="Calibri" w:hAnsi="Calibri" w:eastAsia="Microsoft YaHei"/>
+                <w:b w:val="0"/>
                 <w:sz w:val="20"/>
               </w:rPr>
-              <w:t>yudao-module-mes controller/service/dal、IntRuoyiFronted src/api 与 src/views</w:t>
+              <w:t>前后端分离架构、MES 业务模块、批记录执行服务、EDHR 批次执行服务、Jimu 表单渲染和审批流程集成。</w:t>
             </w:r>
           </w:p>
         </w:tc>
@@ -967,14 +1124,16 @@
           </w:tcPr>
           <w:p>
             <w:pPr>
-              <w:spacing w:before="0" w:after="0" w:line="252" w:lineRule="auto"/>
+              <w:spacing w:after="0"/>
             </w:pPr>
+            <w:r/>
             <w:r>
               <w:rPr>
                 <w:rFonts w:ascii="Calibri" w:hAnsi="Calibri" w:eastAsia="Microsoft YaHei"/>
+                <w:b w:val="0"/>
                 <w:sz w:val="20"/>
               </w:rPr>
-              <w:t>详细接口、服务模块、数据模型和页面入口</w:t>
+              <w:t>确定概要设计和详细设计的技术边界。</w:t>
             </w:r>
           </w:p>
         </w:tc>
@@ -993,14 +1152,16 @@
           </w:tcPr>
           <w:p>
             <w:pPr>
-              <w:spacing w:before="0" w:after="0" w:line="252" w:lineRule="auto"/>
+              <w:spacing w:after="0"/>
             </w:pPr>
+            <w:r/>
             <w:r>
               <w:rPr>
                 <w:rFonts w:ascii="Calibri" w:hAnsi="Calibri" w:eastAsia="Microsoft YaHei"/>
+                <w:b w:val="0"/>
                 <w:sz w:val="20"/>
               </w:rPr>
-              <w:t>历史任务证据</w:t>
+              <w:t>测试验收要求</w:t>
             </w:r>
           </w:p>
         </w:tc>
@@ -1017,14 +1178,16 @@
           </w:tcPr>
           <w:p>
             <w:pPr>
-              <w:spacing w:before="0" w:after="0" w:line="252" w:lineRule="auto"/>
+              <w:spacing w:after="0"/>
             </w:pPr>
+            <w:r/>
             <w:r>
               <w:rPr>
                 <w:rFonts w:ascii="Calibri" w:hAnsi="Calibri" w:eastAsia="Microsoft YaHei"/>
+                <w:b w:val="0"/>
                 <w:sz w:val="20"/>
               </w:rPr>
-              <w:t>doc/tasks/20260724-20260728 相关 EDHR/批记录任务</w:t>
+              <w:t>功能测试、接口联调、真实业务路径验证、异常场景验证、权限验证和归档追溯验证。</w:t>
             </w:r>
           </w:p>
         </w:tc>
@@ -1041,14 +1204,16 @@
           </w:tcPr>
           <w:p>
             <w:pPr>
-              <w:spacing w:before="0" w:after="0" w:line="252" w:lineRule="auto"/>
+              <w:spacing w:after="0"/>
             </w:pPr>
+            <w:r/>
             <w:r>
               <w:rPr>
                 <w:rFonts w:ascii="Calibri" w:hAnsi="Calibri" w:eastAsia="Microsoft YaHei"/>
+                <w:b w:val="0"/>
                 <w:sz w:val="20"/>
               </w:rPr>
-              <w:t>真实修复原因、验收命令、业务边界和回归门禁</w:t>
+              <w:t>确定交付验收和质量验证范围。</w:t>
             </w:r>
           </w:p>
         </w:tc>
@@ -4625,14 +4790,14 @@
           </w:tcPr>
           <w:p>
             <w:pPr>
-              <w:spacing w:before="0" w:after="0" w:line="252" w:lineRule="auto"/>
+              <w:spacing w:after="40"/>
             </w:pPr>
             <w:r>
               <w:rPr>
-                <w:rFonts w:ascii="Calibri" w:hAnsi="Calibri" w:eastAsia="Microsoft YaHei"/>
+                <w:rFonts w:ascii="微软雅黑" w:hAnsi="微软雅黑"/>
                 <w:sz w:val="20"/>
               </w:rPr>
-              <w:t>当前绑定陈旧必须 fail-fast，禁止发布快照通用 fallback。</w:t>
+              <w:t>当前绑定陈旧时必须阻断处理，禁止以发布快照作为通用替代路径。</w:t>
             </w:r>
           </w:p>
         </w:tc>
@@ -4823,14 +4988,14 @@
           </w:tcPr>
           <w:p>
             <w:pPr>
-              <w:spacing w:before="0" w:after="0" w:line="252" w:lineRule="auto"/>
+              <w:spacing w:after="40"/>
             </w:pPr>
             <w:r>
               <w:rPr>
-                <w:rFonts w:ascii="Calibri" w:hAnsi="Calibri" w:eastAsia="Microsoft YaHei"/>
+                <w:rFonts w:ascii="微软雅黑" w:hAnsi="微软雅黑"/>
                 <w:sz w:val="20"/>
               </w:rPr>
-              <w:t>创建/打开执行记录时按规则读取来源字段，目标为空才写入，并记录审计。</w:t>
+              <w:t>创建/打开执行记录时按规则获取来源字段，目标为空才写入，并记录审计。</w:t>
             </w:r>
           </w:p>
         </w:tc>
@@ -6144,14 +6309,16 @@
           </w:tcPr>
           <w:p>
             <w:pPr>
-              <w:spacing w:before="0" w:after="0" w:line="252" w:lineRule="auto"/>
+              <w:spacing w:after="0"/>
             </w:pPr>
+            <w:r/>
             <w:r>
               <w:rPr>
                 <w:rFonts w:ascii="Calibri" w:hAnsi="Calibri" w:eastAsia="Microsoft YaHei"/>
+                <w:b w:val="0"/>
                 <w:sz w:val="20"/>
               </w:rPr>
-              <w:t>本文读取代码、SQL 和历史证据，未对当前真实库 DESCRIBE。</w:t>
+              <w:t>上线前应完成数据库结构、菜单权限、接口联调和业务数据准备的专项核验。</w:t>
             </w:r>
           </w:p>
         </w:tc>
@@ -6292,14 +6459,16 @@
           </w:tcPr>
           <w:p>
             <w:pPr>
-              <w:spacing w:before="0" w:after="0" w:line="252" w:lineRule="auto"/>
+              <w:spacing w:after="0"/>
             </w:pPr>
+            <w:r/>
             <w:r>
               <w:rPr>
                 <w:rFonts w:ascii="Calibri" w:hAnsi="Calibri" w:eastAsia="Microsoft YaHei"/>
+                <w:b w:val="0"/>
                 <w:sz w:val="20"/>
               </w:rPr>
-              <w:t>本文未启动 8081/48081 服务，也未执行真实 E2E。</w:t>
+              <w:t>系统联调和验收测试应在双方确认的测试环境中执行，并形成测试记录。</w:t>
             </w:r>
           </w:p>
         </w:tc>
@@ -6366,14 +6535,16 @@
           </w:tcPr>
           <w:p>
             <w:pPr>
-              <w:spacing w:before="0" w:after="0" w:line="252" w:lineRule="auto"/>
+              <w:spacing w:after="0"/>
             </w:pPr>
+            <w:r/>
             <w:r>
               <w:rPr>
                 <w:rFonts w:ascii="Calibri" w:hAnsi="Calibri" w:eastAsia="Microsoft YaHei"/>
+                <w:b w:val="0"/>
                 <w:sz w:val="20"/>
               </w:rPr>
-              <w:t>BPM、Jimu、文件服务、金蝶/工单同步等依赖未在本文中实测。</w:t>
+              <w:t>审批流程、表单渲染、文件服务及外部系统集成应按接口联调计划逐项验证。</w:t>
             </w:r>
           </w:p>
         </w:tc>
@@ -6390,14 +6561,14 @@
           </w:tcPr>
           <w:p>
             <w:pPr>
-              <w:spacing w:before="0" w:after="0" w:line="252" w:lineRule="auto"/>
+              <w:spacing w:after="40"/>
             </w:pPr>
             <w:r>
               <w:rPr>
-                <w:rFonts w:ascii="Calibri" w:hAnsi="Calibri" w:eastAsia="Microsoft YaHei"/>
+                <w:rFonts w:ascii="微软雅黑" w:hAnsi="微软雅黑"/>
                 <w:sz w:val="20"/>
               </w:rPr>
-              <w:t>集成验证失败时 fail-fast，不允许静默降级。</w:t>
+              <w:t>集成验证失败时 阻断处理，不允许静默降级。</w:t>
             </w:r>
           </w:p>
         </w:tc>
@@ -6416,14 +6587,16 @@
           </w:tcPr>
           <w:p>
             <w:pPr>
-              <w:spacing w:before="0" w:after="0" w:line="252" w:lineRule="auto"/>
+              <w:spacing w:after="0"/>
             </w:pPr>
+            <w:r/>
             <w:r>
               <w:rPr>
                 <w:rFonts w:ascii="Calibri" w:hAnsi="Calibri" w:eastAsia="Microsoft YaHei"/>
+                <w:b w:val="0"/>
                 <w:sz w:val="20"/>
               </w:rPr>
-              <w:t>文档反推</w:t>
+              <w:t>范围控制</w:t>
             </w:r>
           </w:p>
         </w:tc>
@@ -6440,14 +6613,16 @@
           </w:tcPr>
           <w:p>
             <w:pPr>
-              <w:spacing w:before="0" w:after="0" w:line="252" w:lineRule="auto"/>
+              <w:spacing w:after="0"/>
             </w:pPr>
+            <w:r/>
             <w:r>
               <w:rPr>
                 <w:rFonts w:ascii="Calibri" w:hAnsi="Calibri" w:eastAsia="Microsoft YaHei"/>
+                <w:b w:val="0"/>
                 <w:sz w:val="20"/>
               </w:rPr>
-              <w:t>需求是从当前系统倒推，不代表新增产品承诺。</w:t>
+              <w:t>需求、概要和详细设计应在同一范围基线下保持一致；范围变更应通过项目变更流程确认。</w:t>
             </w:r>
           </w:p>
         </w:tc>
@@ -6464,14 +6639,16 @@
           </w:tcPr>
           <w:p>
             <w:pPr>
-              <w:spacing w:before="0" w:after="0" w:line="252" w:lineRule="auto"/>
+              <w:spacing w:after="0"/>
             </w:pPr>
+            <w:r/>
             <w:r>
               <w:rPr>
                 <w:rFonts w:ascii="Calibri" w:hAnsi="Calibri" w:eastAsia="Microsoft YaHei"/>
+                <w:b w:val="0"/>
                 <w:sz w:val="20"/>
               </w:rPr>
-              <w:t>缺证据事项在设计中保持开放问题，不写成已交付能力。</w:t>
+              <w:t>未确认事项应纳入问题清单，并在设计评审或项目变更流程中闭环。</w:t>
             </w:r>
           </w:p>
         </w:tc>
@@ -6500,7 +6677,7 @@
           <w:color w:val="2E74B5"/>
           <w:sz w:val="32"/>
         </w:rPr>
-        <w:t>附录 A：关键证据索引</w:t>
+        <w:t>附录 A：设计依据与术语说明</w:t>
       </w:r>
     </w:p>
     <w:tbl>
@@ -6531,14 +6708,16 @@
           </w:tcPr>
           <w:p>
             <w:pPr>
-              <w:spacing w:before="0" w:after="0" w:line="252" w:lineRule="auto"/>
+              <w:spacing w:after="0"/>
             </w:pPr>
+            <w:r/>
             <w:r>
               <w:rPr>
                 <w:rFonts w:ascii="Calibri" w:hAnsi="Calibri" w:eastAsia="Microsoft YaHei"/>
                 <w:b/>
+                <w:sz w:val="20"/>
               </w:rPr>
-              <w:t>索引</w:t>
+              <w:t>类别</w:t>
             </w:r>
           </w:p>
         </w:tc>
@@ -6556,14 +6735,16 @@
           </w:tcPr>
           <w:p>
             <w:pPr>
-              <w:spacing w:before="0" w:after="0" w:line="252" w:lineRule="auto"/>
+              <w:spacing w:after="0"/>
             </w:pPr>
+            <w:r/>
             <w:r>
               <w:rPr>
                 <w:rFonts w:ascii="Calibri" w:hAnsi="Calibri" w:eastAsia="Microsoft YaHei"/>
                 <w:b/>
+                <w:sz w:val="20"/>
               </w:rPr>
-              <w:t>路径</w:t>
+              <w:t>说明</w:t>
             </w:r>
           </w:p>
         </w:tc>
@@ -6581,14 +6762,16 @@
           </w:tcPr>
           <w:p>
             <w:pPr>
-              <w:spacing w:before="0" w:after="0" w:line="252" w:lineRule="auto"/>
+              <w:spacing w:after="0"/>
             </w:pPr>
+            <w:r/>
             <w:r>
               <w:rPr>
                 <w:rFonts w:ascii="Calibri" w:hAnsi="Calibri" w:eastAsia="Microsoft YaHei"/>
                 <w:b/>
+                <w:sz w:val="20"/>
               </w:rPr>
-              <w:t>说明</w:t>
+              <w:t>适用范围</w:t>
             </w:r>
           </w:p>
         </w:tc>
@@ -6607,14 +6790,16 @@
           </w:tcPr>
           <w:p>
             <w:pPr>
-              <w:spacing w:before="0" w:after="0" w:line="252" w:lineRule="auto"/>
+              <w:spacing w:after="0"/>
             </w:pPr>
+            <w:r/>
             <w:r>
               <w:rPr>
                 <w:rFonts w:ascii="Calibri" w:hAnsi="Calibri" w:eastAsia="Microsoft YaHei"/>
+                <w:b w:val="0"/>
                 <w:sz w:val="20"/>
               </w:rPr>
-              <w:t>A1</w:t>
+              <w:t>需求依据</w:t>
             </w:r>
           </w:p>
         </w:tc>
@@ -6631,14 +6816,16 @@
           </w:tcPr>
           <w:p>
             <w:pPr>
-              <w:spacing w:before="0" w:after="0" w:line="252" w:lineRule="auto"/>
+              <w:spacing w:after="0"/>
             </w:pPr>
+            <w:r/>
             <w:r>
               <w:rPr>
                 <w:rFonts w:ascii="Calibri" w:hAnsi="Calibri" w:eastAsia="Microsoft YaHei"/>
+                <w:b w:val="0"/>
                 <w:sz w:val="20"/>
               </w:rPr>
-              <w:t>IntRuoyiBackend/docs/edhr/existing-edhr-contract.md</w:t>
+              <w:t>业务流程、质量管理、生产执行、电子记录和审计追溯相关要求。</w:t>
             </w:r>
           </w:p>
         </w:tc>
@@ -6655,14 +6842,16 @@
           </w:tcPr>
           <w:p>
             <w:pPr>
-              <w:spacing w:before="0" w:after="0" w:line="252" w:lineRule="auto"/>
+              <w:spacing w:after="0"/>
             </w:pPr>
+            <w:r/>
             <w:r>
               <w:rPr>
                 <w:rFonts w:ascii="Calibri" w:hAnsi="Calibri" w:eastAsia="Microsoft YaHei"/>
+                <w:b w:val="0"/>
                 <w:sz w:val="20"/>
               </w:rPr>
-              <w:t>后端现有合约、控制器、权限、数据对象和禁止改写边界。</w:t>
+              <w:t>需求设计、验收标准和业务规则。</w:t>
             </w:r>
           </w:p>
         </w:tc>
@@ -6681,14 +6870,16 @@
           </w:tcPr>
           <w:p>
             <w:pPr>
-              <w:spacing w:before="0" w:after="0" w:line="252" w:lineRule="auto"/>
+              <w:spacing w:after="0"/>
             </w:pPr>
+            <w:r/>
             <w:r>
               <w:rPr>
                 <w:rFonts w:ascii="Calibri" w:hAnsi="Calibri" w:eastAsia="Microsoft YaHei"/>
+                <w:b w:val="0"/>
                 <w:sz w:val="20"/>
               </w:rPr>
-              <w:t>A2</w:t>
+              <w:t>设计依据</w:t>
             </w:r>
           </w:p>
         </w:tc>
@@ -6705,14 +6896,16 @@
           </w:tcPr>
           <w:p>
             <w:pPr>
-              <w:spacing w:before="0" w:after="0" w:line="252" w:lineRule="auto"/>
+              <w:spacing w:after="0"/>
             </w:pPr>
+            <w:r/>
             <w:r>
               <w:rPr>
                 <w:rFonts w:ascii="Calibri" w:hAnsi="Calibri" w:eastAsia="Microsoft YaHei"/>
+                <w:b w:val="0"/>
                 <w:sz w:val="20"/>
               </w:rPr>
-              <w:t>IntRuoyiFronted/docs/edhr/existing-edhr-frontend-contract.md</w:t>
+              <w:t>系统模块划分、接口分组、数据模型、权限审计、归档追溯和交付验证要求。</w:t>
             </w:r>
           </w:p>
         </w:tc>
@@ -6729,14 +6922,16 @@
           </w:tcPr>
           <w:p>
             <w:pPr>
-              <w:spacing w:before="0" w:after="0" w:line="252" w:lineRule="auto"/>
+              <w:spacing w:after="0"/>
             </w:pPr>
+            <w:r/>
             <w:r>
               <w:rPr>
                 <w:rFonts w:ascii="Calibri" w:hAnsi="Calibri" w:eastAsia="Microsoft YaHei"/>
+                <w:b w:val="0"/>
                 <w:sz w:val="20"/>
               </w:rPr>
-              <w:t>前端 API、页面入口和权限门禁。</w:t>
+              <w:t>概要设计和详细设计。</w:t>
             </w:r>
           </w:p>
         </w:tc>
@@ -6755,14 +6950,16 @@
           </w:tcPr>
           <w:p>
             <w:pPr>
-              <w:spacing w:before="0" w:after="0" w:line="252" w:lineRule="auto"/>
+              <w:spacing w:after="0"/>
             </w:pPr>
+            <w:r/>
             <w:r>
               <w:rPr>
                 <w:rFonts w:ascii="Calibri" w:hAnsi="Calibri" w:eastAsia="Microsoft YaHei"/>
+                <w:b w:val="0"/>
                 <w:sz w:val="20"/>
               </w:rPr>
-              <w:t>A3</w:t>
+              <w:t>术语约定</w:t>
             </w:r>
           </w:p>
         </w:tc>
@@ -6779,14 +6976,16 @@
           </w:tcPr>
           <w:p>
             <w:pPr>
-              <w:spacing w:before="0" w:after="0" w:line="252" w:lineRule="auto"/>
+              <w:spacing w:after="0"/>
             </w:pPr>
+            <w:r/>
             <w:r>
               <w:rPr>
                 <w:rFonts w:ascii="Calibri" w:hAnsi="Calibri" w:eastAsia="Microsoft YaHei"/>
+                <w:b w:val="0"/>
                 <w:sz w:val="20"/>
               </w:rPr>
-              <w:t>docs/backend-development.md</w:t>
+              <w:t>批记录表单、表单槽位、工序开始、批次执行、工作任务、字段审计链等术语按本文定义使用。</w:t>
             </w:r>
           </w:p>
         </w:tc>
@@ -6803,14 +7002,16 @@
           </w:tcPr>
           <w:p>
             <w:pPr>
-              <w:spacing w:before="0" w:after="0" w:line="252" w:lineRule="auto"/>
+              <w:spacing w:after="0"/>
             </w:pPr>
+            <w:r/>
             <w:r>
               <w:rPr>
                 <w:rFonts w:ascii="Calibri" w:hAnsi="Calibri" w:eastAsia="Microsoft YaHei"/>
+                <w:b w:val="0"/>
                 <w:sz w:val="20"/>
               </w:rPr>
-              <w:t>EDHR 详情回填、快照、版本治理、单元格链接、Word 解析和放行负责人门禁。</w:t>
+              <w:t>需求、概要、详细设计全文。</w:t>
             </w:r>
           </w:p>
         </w:tc>
@@ -6829,14 +7030,16 @@
           </w:tcPr>
           <w:p>
             <w:pPr>
-              <w:spacing w:before="0" w:after="0" w:line="252" w:lineRule="auto"/>
+              <w:spacing w:after="0"/>
             </w:pPr>
+            <w:r/>
             <w:r>
               <w:rPr>
                 <w:rFonts w:ascii="Calibri" w:hAnsi="Calibri" w:eastAsia="Microsoft YaHei"/>
+                <w:b w:val="0"/>
                 <w:sz w:val="20"/>
               </w:rPr>
-              <w:t>A4</w:t>
+              <w:t>控制原则</w:t>
             </w:r>
           </w:p>
         </w:tc>
@@ -6853,14 +7056,16 @@
           </w:tcPr>
           <w:p>
             <w:pPr>
-              <w:spacing w:before="0" w:after="0" w:line="252" w:lineRule="auto"/>
+              <w:spacing w:after="0"/>
             </w:pPr>
+            <w:r/>
             <w:r>
               <w:rPr>
                 <w:rFonts w:ascii="Calibri" w:hAnsi="Calibri" w:eastAsia="Microsoft YaHei"/>
+                <w:b w:val="0"/>
                 <w:sz w:val="20"/>
               </w:rPr>
-              <w:t>docs/e2e-rules.md</w:t>
+              <w:t>正式批记录表单、补充表单槽位和工序开始配置分别建模、分别展示、分别验证。</w:t>
             </w:r>
           </w:p>
         </w:tc>
@@ -6877,14 +7082,16 @@
           </w:tcPr>
           <w:p>
             <w:pPr>
-              <w:spacing w:before="0" w:after="0" w:line="252" w:lineRule="auto"/>
+              <w:spacing w:after="0"/>
             </w:pPr>
+            <w:r/>
             <w:r>
               <w:rPr>
                 <w:rFonts w:ascii="Calibri" w:hAnsi="Calibri" w:eastAsia="Microsoft YaHei"/>
+                <w:b w:val="0"/>
                 <w:sz w:val="20"/>
               </w:rPr>
-              <w:t>真实 E2E、作废闭环、工作任务、只读追踪和页面断言门禁。</w:t>
+              <w:t>业务流程、接口设计和测试验收。</w:t>
             </w:r>
           </w:p>
         </w:tc>
@@ -6903,14 +7110,15 @@
           </w:tcPr>
           <w:p>
             <w:pPr>
-              <w:spacing w:before="0" w:after="0" w:line="252" w:lineRule="auto"/>
+              <w:spacing w:after="0"/>
             </w:pPr>
+            <w:r/>
             <w:r>
               <w:rPr>
                 <w:rFonts w:ascii="Calibri" w:hAnsi="Calibri" w:eastAsia="Microsoft YaHei"/>
+                <w:b w:val="0"/>
                 <w:sz w:val="20"/>
               </w:rPr>
-              <w:t>A5</w:t>
             </w:r>
           </w:p>
         </w:tc>
@@ -6927,14 +7135,15 @@
           </w:tcPr>
           <w:p>
             <w:pPr>
-              <w:spacing w:before="0" w:after="0" w:line="252" w:lineRule="auto"/>
+              <w:spacing w:after="0"/>
             </w:pPr>
+            <w:r/>
             <w:r>
               <w:rPr>
                 <w:rFonts w:ascii="Calibri" w:hAnsi="Calibri" w:eastAsia="Microsoft YaHei"/>
+                <w:b w:val="0"/>
                 <w:sz w:val="20"/>
               </w:rPr>
-              <w:t>AGENTS.md</w:t>
             </w:r>
           </w:p>
         </w:tc>
@@ -6951,14 +7160,15 @@
           </w:tcPr>
           <w:p>
             <w:pPr>
-              <w:spacing w:before="0" w:after="0" w:line="252" w:lineRule="auto"/>
+              <w:spacing w:after="0"/>
             </w:pPr>
+            <w:r/>
             <w:r>
               <w:rPr>
                 <w:rFonts w:ascii="Calibri" w:hAnsi="Calibri" w:eastAsia="Microsoft YaHei"/>
+                <w:b w:val="0"/>
                 <w:sz w:val="20"/>
               </w:rPr>
-              <w:t>工艺路线三类配置术语契约和无 fallback 原则。</w:t>
             </w:r>
           </w:p>
         </w:tc>
@@ -6977,14 +7187,15 @@
           </w:tcPr>
           <w:p>
             <w:pPr>
-              <w:spacing w:before="0" w:after="0" w:line="252" w:lineRule="auto"/>
+              <w:spacing w:after="0"/>
             </w:pPr>
+            <w:r/>
             <w:r>
               <w:rPr>
                 <w:rFonts w:ascii="Calibri" w:hAnsi="Calibri" w:eastAsia="Microsoft YaHei"/>
+                <w:b w:val="0"/>
                 <w:sz w:val="20"/>
               </w:rPr>
-              <w:t>A6</w:t>
             </w:r>
           </w:p>
         </w:tc>
@@ -7001,14 +7212,15 @@
           </w:tcPr>
           <w:p>
             <w:pPr>
-              <w:spacing w:before="0" w:after="0" w:line="252" w:lineRule="auto"/>
+              <w:spacing w:after="0"/>
             </w:pPr>
+            <w:r/>
             <w:r>
               <w:rPr>
                 <w:rFonts w:ascii="Calibri" w:hAnsi="Calibri" w:eastAsia="Microsoft YaHei"/>
+                <w:b w:val="0"/>
                 <w:sz w:val="20"/>
               </w:rPr>
-              <w:t>doc/tasks/20260727-edhr-cell-link-auto-persist-design</w:t>
             </w:r>
           </w:p>
         </w:tc>
@@ -7025,14 +7237,15 @@
           </w:tcPr>
           <w:p>
             <w:pPr>
-              <w:spacing w:before="0" w:after="0" w:line="252" w:lineRule="auto"/>
+              <w:spacing w:after="0"/>
             </w:pPr>
+            <w:r/>
             <w:r>
               <w:rPr>
                 <w:rFonts w:ascii="Calibri" w:hAnsi="Calibri" w:eastAsia="Microsoft YaHei"/>
+                <w:b w:val="0"/>
                 <w:sz w:val="20"/>
               </w:rPr>
-              <w:t>单元格链接后端自动落库详细设计证据。</w:t>
             </w:r>
           </w:p>
         </w:tc>
@@ -7051,14 +7264,15 @@
           </w:tcPr>
           <w:p>
             <w:pPr>
-              <w:spacing w:before="0" w:after="0" w:line="252" w:lineRule="auto"/>
+              <w:spacing w:after="0"/>
             </w:pPr>
+            <w:r/>
             <w:r>
               <w:rPr>
                 <w:rFonts w:ascii="Calibri" w:hAnsi="Calibri" w:eastAsia="Microsoft YaHei"/>
+                <w:b w:val="0"/>
                 <w:sz w:val="20"/>
               </w:rPr>
-              <w:t>A7</w:t>
             </w:r>
           </w:p>
         </w:tc>
@@ -7075,14 +7289,15 @@
           </w:tcPr>
           <w:p>
             <w:pPr>
-              <w:spacing w:before="0" w:after="0" w:line="252" w:lineRule="auto"/>
+              <w:spacing w:after="0"/>
             </w:pPr>
+            <w:r/>
             <w:r>
               <w:rPr>
                 <w:rFonts w:ascii="Calibri" w:hAnsi="Calibri" w:eastAsia="Microsoft YaHei"/>
+                <w:b w:val="0"/>
                 <w:sz w:val="20"/>
               </w:rPr>
-              <w:t>doc/tasks/20260727-edhr-batch-void-work-task-closure</w:t>
             </w:r>
           </w:p>
         </w:tc>
@@ -7099,14 +7314,15 @@
           </w:tcPr>
           <w:p>
             <w:pPr>
-              <w:spacing w:before="0" w:after="0" w:line="252" w:lineRule="auto"/>
+              <w:spacing w:after="0"/>
             </w:pPr>
+            <w:r/>
             <w:r>
               <w:rPr>
                 <w:rFonts w:ascii="Calibri" w:hAnsi="Calibri" w:eastAsia="Microsoft YaHei"/>
+                <w:b w:val="0"/>
                 <w:sz w:val="20"/>
               </w:rPr>
-              <w:t>批次作废后工作台任务闭环需求和设计证据。</w:t>
             </w:r>
           </w:p>
         </w:tc>
@@ -7125,7 +7341,7 @@
           <w:color w:val="2E74B5"/>
           <w:sz w:val="32"/>
         </w:rPr>
-        <w:t>附录 B：文档生成说明</w:t>
+        <w:t>附录 B：文档控制</w:t>
       </w:r>
     </w:p>
     <w:p>
@@ -7136,8 +7352,10 @@
       <w:r>
         <w:rPr>
           <w:rFonts w:ascii="Calibri" w:hAnsi="Calibri" w:eastAsia="Microsoft YaHei"/>
+          <w:b w:val="0"/>
+          <w:sz w:val="22"/>
         </w:rPr>
-        <w:t>文档采用 standard_business_brief 风格：Calibri/Microsoft YaHei、US Letter、1 inch 页边距、蓝色标题、灰色表头。</w:t>
+        <w:t>文档采用统一的正式交付版式，标题、正文、表格和附录保持一致的排版规范。</w:t>
       </w:r>
     </w:p>
     <w:p>
@@ -7148,8 +7366,10 @@
       <w:r>
         <w:rPr>
           <w:rFonts w:ascii="Calibri" w:hAnsi="Calibri" w:eastAsia="Microsoft YaHei"/>
+          <w:b w:val="0"/>
+          <w:sz w:val="22"/>
         </w:rPr>
-        <w:t>本文不插入未验证的生产数据、账号、密码、真实租户或连接串。</w:t>
+        <w:t>文档不包含生产账号、密码、连接串、密钥或其他敏感信息。</w:t>
       </w:r>
     </w:p>
     <w:p>
@@ -7160,8 +7380,10 @@
       <w:r>
         <w:rPr>
           <w:rFonts w:ascii="Calibri" w:hAnsi="Calibri" w:eastAsia="Microsoft YaHei"/>
+          <w:b w:val="0"/>
+          <w:sz w:val="22"/>
         </w:rPr>
-        <w:t>本文中的接口、表、页面均来自当前工作区只读抽取或已存在项目文档。</w:t>
+        <w:t>接口、数据对象和页面说明以系统设计边界、业务流程和技术实现方案为依据。</w:t>
       </w:r>
     </w:p>
     <w:p>
@@ -7172,8 +7394,10 @@
       <w:r>
         <w:rPr>
           <w:rFonts w:ascii="Calibri" w:hAnsi="Calibri" w:eastAsia="Microsoft YaHei"/>
+          <w:b w:val="0"/>
+          <w:sz w:val="22"/>
         </w:rPr>
-        <w:t>如需正式立项交付，可将本文拆分为三份独立 Word：需求设计、概要设计、详细设计。</w:t>
+        <w:t>需求设计、概要设计和详细设计共同构成本系统建设的成套交付资料。</w:t>
       </w:r>
     </w:p>
     <w:sectPr>

</xml_diff>